<commit_message>
Update version of assignment 3 notebook and adjust execution counts. Changed the version number in MBD_2025_Tri1_assignment3a_a1779263_AryanMoradi.ipynb to version 05 and updated execution counts for consistency across cells. Modified MBD_2025_Tri1_assignment3a_a1779263_AryanMoradi_version05.docx to reflect changes.
</commit_message>
<xml_diff>
--- a/MBD_2025_Tri1_assignment3a_a1779263_AryanMoradi_version05.docx
+++ b/MBD_2025_Tri1_assignment3a_a1779263_AryanMoradi_version05.docx
@@ -1056,19 +1056,7 @@
         <w:t xml:space="preserve">, however we must ensure that the items present are not in the user’s purchase history since we don’t want to recommend something they have already bought. </w:t>
       </w:r>
       <w:r>
-        <w:t>Once this is handled, f</w:t>
-      </w:r>
-      <w:r>
-        <w:t xml:space="preserve">or each item in the rule’s consequent that the user hasn’t already bought, </w:t>
-      </w:r>
-      <w:r>
-        <w:t>the function</w:t>
-      </w:r>
-      <w:r>
-        <w:t xml:space="preserve"> builds a score:</w:t>
-      </w:r>
-      <w:r>
-        <w:t xml:space="preserve"> `</w:t>
+        <w:t>Once this is handled, for each item in the rule’s consequent that the user hasn’t already bought, the function builds a score: `</w:t>
       </w:r>
       <w:proofErr w:type="spellStart"/>
       <w:r>
@@ -1076,139 +1064,201 @@
       </w:r>
       <w:proofErr w:type="spellEnd"/>
       <w:r>
+        <w:t>` is the average of the user’s recency-weighted values for the overlapping items (reflecting how recently the user bought things that trigger the rule). `</w:t>
+      </w:r>
+      <w:proofErr w:type="spellStart"/>
+      <w:r>
+        <w:t>rule_score</w:t>
+      </w:r>
+      <w:proofErr w:type="spellEnd"/>
+      <w:r>
+        <w:t xml:space="preserve">` is the rule’s own strength (confidence * lift) adjusted by </w:t>
+      </w:r>
+      <w:proofErr w:type="spellStart"/>
+      <w:r>
+        <w:t>overlap_score</w:t>
+      </w:r>
+      <w:proofErr w:type="spellEnd"/>
+      <w:r>
+        <w:t>. `</w:t>
+      </w:r>
+      <w:proofErr w:type="spellStart"/>
+      <w:r>
+        <w:t>final_score</w:t>
+      </w:r>
+      <w:proofErr w:type="spellEnd"/>
+      <w:r>
+        <w:t xml:space="preserve">` multiplies </w:t>
+      </w:r>
+      <w:proofErr w:type="spellStart"/>
+      <w:r>
+        <w:t>rule_score</w:t>
+      </w:r>
+      <w:proofErr w:type="spellEnd"/>
+      <w:r>
+        <w:t xml:space="preserve"> by (1 + </w:t>
+      </w:r>
+      <w:proofErr w:type="spellStart"/>
+      <w:r>
+        <w:t>recency_score</w:t>
+      </w:r>
+      <w:proofErr w:type="spellEnd"/>
+      <w:r>
+        <w:t xml:space="preserve">) so that recent </w:t>
+      </w:r>
+      <w:proofErr w:type="spellStart"/>
+      <w:r>
+        <w:t>behaviour</w:t>
+      </w:r>
+      <w:proofErr w:type="spellEnd"/>
+      <w:r>
+        <w:t xml:space="preserve"> boosts the recommendation. </w:t>
+      </w:r>
+      <w:r>
+        <w:t xml:space="preserve">That </w:t>
+      </w:r>
+      <w:proofErr w:type="spellStart"/>
+      <w:r>
+        <w:t>final_score</w:t>
+      </w:r>
+      <w:proofErr w:type="spellEnd"/>
+      <w:r>
+        <w:t xml:space="preserve"> is added into the running total for the candidate item in recommendations. After every rule has been processed, the dictionary is sorted from highest to lowest score, and the function returns the first </w:t>
+      </w:r>
+      <w:r>
         <w:t>`</w:t>
       </w:r>
-      <w:r>
-        <w:t xml:space="preserve"> is the average of the user’s recency-weighted values for the overlapping items (reflecting how recently the user bought things that trigger the rule).</w:t>
-      </w:r>
-      <w:r>
-        <w:t xml:space="preserve"> `</w:t>
-      </w:r>
-      <w:proofErr w:type="spellStart"/>
-      <w:r>
-        <w:t>rule_score</w:t>
+      <w:proofErr w:type="spellStart"/>
+      <w:r>
+        <w:t>top_n</w:t>
       </w:r>
       <w:proofErr w:type="spellEnd"/>
       <w:r>
         <w:t>`</w:t>
       </w:r>
       <w:r>
-        <w:t xml:space="preserve"> is the rule’s own strength (confidence </w:t>
-      </w:r>
-      <w:r>
-        <w:t>*</w:t>
-      </w:r>
-      <w:r>
-        <w:t xml:space="preserve"> lift) adjusted by </w:t>
-      </w:r>
-      <w:proofErr w:type="spellStart"/>
-      <w:r>
-        <w:t>overlap_score</w:t>
-      </w:r>
-      <w:proofErr w:type="spellEnd"/>
+        <w:t xml:space="preserve"> entries as the recommended items.</w:t>
+      </w:r>
+      <w:r>
+        <w:t xml:space="preserve"> </w:t>
+      </w:r>
+      <w:proofErr w:type="gramStart"/>
+      <w:r>
+        <w:t>Next</w:t>
+      </w:r>
+      <w:proofErr w:type="gramEnd"/>
+      <w:r>
+        <w:t xml:space="preserve"> we develop a function to handle the test case edge case for when a user is a fresh costumer and has no shopping history. The function simply </w:t>
+      </w:r>
+      <w:proofErr w:type="spellStart"/>
+      <w:r>
+        <w:t>retunrs</w:t>
+      </w:r>
+      <w:proofErr w:type="spellEnd"/>
+      <w:r>
+        <w:t xml:space="preserve"> the top k list of the most bought items based on the `</w:t>
+      </w:r>
+      <w:r>
+        <w:t xml:space="preserve"> </w:t>
+      </w:r>
+      <w:proofErr w:type="spellStart"/>
+      <w:r>
+        <w:t>itemDescription</w:t>
+      </w:r>
+      <w:proofErr w:type="spellEnd"/>
+      <w:r>
+        <w:t>` in the dataset.</w:t>
+      </w:r>
+    </w:p>
+    <w:p>
+      <w:r>
+        <w:t xml:space="preserve"> </w:t>
+      </w:r>
+    </w:p>
+    <w:p>
+      <w:r>
+        <w:t xml:space="preserve">Task 2 Version </w:t>
+      </w:r>
+      <w:r>
+        <w:t xml:space="preserve">5 </w:t>
+      </w:r>
+      <w:r>
+        <w:t>draft:</w:t>
+      </w:r>
+      <w:r>
+        <w:br/>
+      </w:r>
+      <w:r>
+        <w:t>In v</w:t>
+      </w:r>
+      <w:r>
+        <w:t xml:space="preserve">ersion 5 </w:t>
+      </w:r>
+      <w:r>
+        <w:t xml:space="preserve">we </w:t>
+      </w:r>
+      <w:r>
+        <w:t xml:space="preserve">mainly </w:t>
+      </w:r>
+      <w:r>
+        <w:t>add</w:t>
+      </w:r>
+      <w:r>
+        <w:t xml:space="preserve"> the evaluation part of the system. </w:t>
+      </w:r>
+      <w:r>
+        <w:t xml:space="preserve">We </w:t>
+      </w:r>
+      <w:r>
+        <w:t xml:space="preserve">introduce new functions to split the dataset chronologically and to measure the recommendation performance using different metrics like </w:t>
+      </w:r>
+      <w:proofErr w:type="spellStart"/>
+      <w:r>
+        <w:t>Precision@k</w:t>
+      </w:r>
+      <w:proofErr w:type="spellEnd"/>
+      <w:r>
+        <w:t xml:space="preserve">, </w:t>
+      </w:r>
+      <w:proofErr w:type="spellStart"/>
+      <w:r>
+        <w:t>Recall@k</w:t>
+      </w:r>
+      <w:proofErr w:type="spellEnd"/>
+      <w:r>
+        <w:t xml:space="preserve">, </w:t>
+      </w:r>
+      <w:proofErr w:type="spellStart"/>
+      <w:r>
+        <w:t>NDCG@k</w:t>
+      </w:r>
+      <w:proofErr w:type="spellEnd"/>
+      <w:r>
+        <w:t xml:space="preserve">, </w:t>
+      </w:r>
+      <w:proofErr w:type="spellStart"/>
+      <w:r>
+        <w:t>MAP@k</w:t>
+      </w:r>
+      <w:proofErr w:type="spellEnd"/>
+      <w:r>
+        <w:t>, and Hit Rate.</w:t>
+      </w:r>
+      <w:r>
+        <w:br/>
+        <w:t>There were no major changes to the main collaborative filtering logic or utility matrix generation. Only small cleanups were made.</w:t>
+      </w:r>
+      <w:r>
+        <w:br/>
+        <w:t xml:space="preserve">The full detailed explanation of the new functions and how they will be used will be included in the final paper when all the team codes are </w:t>
+      </w:r>
+      <w:proofErr w:type="gramStart"/>
+      <w:r>
+        <w:t>combined together</w:t>
+      </w:r>
+      <w:proofErr w:type="gramEnd"/>
       <w:r>
         <w:t>.</w:t>
-      </w:r>
-      <w:r>
-        <w:t xml:space="preserve"> `</w:t>
-      </w:r>
-      <w:proofErr w:type="spellStart"/>
-      <w:r>
-        <w:t>final_score</w:t>
-      </w:r>
-      <w:proofErr w:type="spellEnd"/>
-      <w:r>
-        <w:t>`</w:t>
-      </w:r>
-      <w:r>
-        <w:t xml:space="preserve"> multiplies </w:t>
-      </w:r>
-      <w:proofErr w:type="spellStart"/>
-      <w:r>
-        <w:t>rule_score</w:t>
-      </w:r>
-      <w:proofErr w:type="spellEnd"/>
-      <w:r>
-        <w:t xml:space="preserve"> by (1 + </w:t>
-      </w:r>
-      <w:proofErr w:type="spellStart"/>
-      <w:r>
-        <w:t>recency_score</w:t>
-      </w:r>
-      <w:proofErr w:type="spellEnd"/>
-      <w:r>
-        <w:t xml:space="preserve">) so that recent </w:t>
-      </w:r>
-      <w:proofErr w:type="spellStart"/>
-      <w:r>
-        <w:t>behaviour</w:t>
-      </w:r>
-      <w:proofErr w:type="spellEnd"/>
-      <w:r>
-        <w:t xml:space="preserve"> boosts the recommendation.</w:t>
-      </w:r>
-      <w:r>
-        <w:t xml:space="preserve"> </w:t>
-      </w:r>
-      <w:r>
-        <w:t xml:space="preserve">That </w:t>
-      </w:r>
-      <w:proofErr w:type="spellStart"/>
-      <w:r>
-        <w:t>final_score</w:t>
-      </w:r>
-      <w:proofErr w:type="spellEnd"/>
-      <w:r>
-        <w:t xml:space="preserve"> is added into the running total for the candidate item in recommendations. After every rule has been processed, the dictionary is sorted from highest to lowest score, and the function returns the first </w:t>
-      </w:r>
-      <w:r>
-        <w:t>`</w:t>
-      </w:r>
-      <w:proofErr w:type="spellStart"/>
-      <w:r>
-        <w:t>top_n</w:t>
-      </w:r>
-      <w:proofErr w:type="spellEnd"/>
-      <w:r>
-        <w:t>`</w:t>
-      </w:r>
-      <w:r>
-        <w:t xml:space="preserve"> entries as the recommended items.</w:t>
-      </w:r>
-      <w:r>
-        <w:t xml:space="preserve"> </w:t>
-      </w:r>
-      <w:proofErr w:type="gramStart"/>
-      <w:r>
-        <w:t>Next</w:t>
-      </w:r>
-      <w:proofErr w:type="gramEnd"/>
-      <w:r>
-        <w:t xml:space="preserve"> we develop a function to handle the test case edge case for when a user is a fresh costumer and has no shopping history. The function simply </w:t>
-      </w:r>
-      <w:proofErr w:type="spellStart"/>
-      <w:r>
-        <w:t>retunrs</w:t>
-      </w:r>
-      <w:proofErr w:type="spellEnd"/>
-      <w:r>
-        <w:t xml:space="preserve"> the top k list of the most bought items based on the `</w:t>
-      </w:r>
-      <w:r>
-        <w:t xml:space="preserve"> </w:t>
-      </w:r>
-      <w:proofErr w:type="spellStart"/>
-      <w:r>
-        <w:t>itemDescription</w:t>
-      </w:r>
-      <w:proofErr w:type="spellEnd"/>
-      <w:r>
-        <w:t>` in the dataset.</w:t>
-      </w:r>
-    </w:p>
-    <w:p>
-      <w:r>
-        <w:t xml:space="preserve"> </w:t>
       </w:r>
     </w:p>
     <w:sectPr>

</xml_diff>